<commit_message>
workflow erster entwurf vaildierung lokales nslphom
</commit_message>
<xml_diff>
--- a/MeinMaterial/Besprechungen/Gespräch2.docx
+++ b/MeinMaterial/Besprechungen/Gespräch2.docx
@@ -98,7 +98,15 @@
       </w:r>
       <w:r>
         <w:br/>
-        <w:t>Aggregationen nicht nur auf Plausibilität sondern auf Korrektheit prüfen</w:t>
+        <w:t xml:space="preserve">Aggregationen nicht nur auf </w:t>
+      </w:r>
+      <w:proofErr w:type="gramStart"/>
+      <w:r>
+        <w:t>Plausibilität</w:t>
+      </w:r>
+      <w:proofErr w:type="gramEnd"/>
+      <w:r>
+        <w:t xml:space="preserve"> sondern auf Korrektheit prüfen</w:t>
       </w:r>
       <w:r>
         <w:br/>
@@ -198,7 +206,15 @@
         <w:br/>
       </w:r>
       <w:r>
-        <w:t>Paper, Berechnungen verstehen, Matrizen verstehen, Optimierung selbst sehr informatisch  nicht im detail</w:t>
+        <w:t xml:space="preserve">Paper, Berechnungen verstehen, Matrizen verstehen, Optimierung selbst sehr </w:t>
+      </w:r>
+      <w:proofErr w:type="gramStart"/>
+      <w:r>
+        <w:t>informatisch  nicht</w:t>
+      </w:r>
+      <w:proofErr w:type="gramEnd"/>
+      <w:r>
+        <w:t xml:space="preserve"> im detail</w:t>
       </w:r>
       <w:r>
         <w:t xml:space="preserve"> </w:t>
@@ -277,11 +293,23 @@
         <w:t xml:space="preserve"> einfach halten (2 Parteien Szenario oder so)</w:t>
       </w:r>
       <w:r>
-        <w:t xml:space="preserve"> zu beginn Wahlergebnis, Einflüsse auf übergangswahrscheinlichkeiten bekannt (eine binäre Variable, eine kontinuierlich (simpel halten)</w:t>
-      </w:r>
-      <w:r>
-        <w:br/>
-        <w:t xml:space="preserve">simulieren </w:t>
+        <w:t xml:space="preserve"> zu beginn Wahlergebnis, Einflüsse auf übergangswahrscheinlichkeiten bekannt (eine binäre Variable, eine kontinuierlich (simpel halten</w:t>
+      </w:r>
+      <w:r>
+        <w:t>, logit modell als einfluss bspw.</w:t>
+      </w:r>
+      <w:r>
+        <w:t>)</w:t>
+      </w:r>
+      <w:r>
+        <w:br/>
+        <w:t>simulieren</w:t>
+      </w:r>
+      <w:r>
+        <w:t xml:space="preserve"> Variablen</w:t>
+      </w:r>
+      <w:r>
+        <w:t xml:space="preserve"> </w:t>
       </w:r>
       <w:r>
         <w:t xml:space="preserve">X_i </w:t>
@@ -291,21 +319,36 @@
       </w:r>
       <w:r>
         <w:br/>
-        <w:t xml:space="preserve">dann mit den übergangswahrscheinlichkeiten Wahlergebnis 2 berechnen </w:t>
+        <w:t xml:space="preserve">dann mit den </w:t>
+      </w:r>
+      <w:r>
+        <w:t xml:space="preserve">Variablen </w:t>
+      </w:r>
+      <w:r>
+        <w:t xml:space="preserve">übergangswahrscheinlichkeiten </w:t>
+      </w:r>
+      <w:r>
+        <w:t xml:space="preserve">und somit </w:t>
+      </w:r>
+      <w:r>
+        <w:t xml:space="preserve">Wahlergebnis 2 berechnen </w:t>
       </w:r>
       <w:r>
         <w:br/>
         <w:t xml:space="preserve">nslphorm anwenden </w:t>
       </w:r>
       <w:r>
+        <w:t xml:space="preserve">auf beiden Wahlergebnissen </w:t>
+      </w:r>
+      <w:r>
         <w:sym w:font="Wingdings" w:char="F0E0"/>
       </w:r>
       <w:r>
-        <w:t xml:space="preserve"> schauen ob die übergangswahrscheinlichkeiten korrekt geschätzt </w:t>
+        <w:t xml:space="preserve"> schauen ob die </w:t>
       </w:r>
       <w:r>
         <w:lastRenderedPageBreak/>
-        <w:t>wurden (wir kennen sie durch verändernde Kovariablen und betas die wir festgesetzt hatten)</w:t>
+        <w:t>übergangswahrscheinlichkeiten korrekt geschätzt wurden (wir kennen sie durch verändernde Kovariablen und betas die wir festgesetzt hatten)</w:t>
       </w:r>
       <w:r>
         <w:br/>
@@ -323,12 +366,50 @@
         <w:sym w:font="Wingdings" w:char="F0E0"/>
       </w:r>
       <w:r>
-        <w:t xml:space="preserve"> Ziel: testen: erkennt unser modell die wahren einflussfaktoren korrekt</w:t>
-      </w:r>
-    </w:p>
-    <w:p>
-      <w:r>
-        <w:t>Frage hier zur Validierung (nach Gespräch aufgekommen): Modell arbeitet doch ohne einflussfaktoren,  hat nur Wahlergebnisse, da kann man doch wahre einflussfaktoren nicht testen, nur wahre übergangswskeiten (aber hab ich mir nur glaub falsch gemerkt, wie hier geschrieben wars gemeint)</w:t>
+        <w:t xml:space="preserve"> Ziel: testen: erkennt unser modell die wahren</w:t>
+      </w:r>
+      <w:r>
+        <w:t xml:space="preserve"> übergangswahrscheinlichkeiten</w:t>
+      </w:r>
+      <w:r>
+        <w:br/>
+      </w:r>
+      <w:r>
+        <w:br/>
+      </w:r>
+      <w:r>
+        <w:sym w:font="Wingdings" w:char="F0E0"/>
+      </w:r>
+      <w:r>
+        <w:t xml:space="preserve"> weiterführender test: erkennt unser modell die</w:t>
+      </w:r>
+      <w:r>
+        <w:t xml:space="preserve"> einflussfaktoren korrekt</w:t>
+      </w:r>
+      <w:r>
+        <w:br/>
+        <w:t>(dazu vllt dann noch anhand der übergangswskeiten modell schätzen mit kovariablen: dann schauen ob geschätzte beta gleich vorher festgelegten betas)</w:t>
+      </w:r>
+    </w:p>
+    <w:p>
+      <w:r>
+        <w:t xml:space="preserve">Frage hier zur Validierung (nach Gespräch aufgekommen): Modell arbeitet doch ohne </w:t>
+      </w:r>
+      <w:proofErr w:type="gramStart"/>
+      <w:r>
+        <w:t>einflussfaktoren,  hat</w:t>
+      </w:r>
+      <w:proofErr w:type="gramEnd"/>
+      <w:r>
+        <w:t xml:space="preserve"> nur Wahlergebnisse, da kann man doch wahre einflussfaktoren nicht testen, nur wahre übergangswskeiten (aber </w:t>
+      </w:r>
+      <w:proofErr w:type="gramStart"/>
+      <w:r>
+        <w:t>hab</w:t>
+      </w:r>
+      <w:proofErr w:type="gramEnd"/>
+      <w:r>
+        <w:t xml:space="preserve"> ich mir nur glaub falsch gemerkt, wie hier geschrieben wars gemeint)</w:t>
       </w:r>
     </w:p>
     <w:p/>
@@ -440,12 +521,18 @@
       </w:r>
       <w:r>
         <w:br/>
-      </w:r>
-      <w:r>
-        <w:t>modell_gewichtet &lt;- glm(</w:t>
-      </w:r>
-      <w:r>
-        <w:t xml:space="preserve">   # man betrachtet alle parteien einzelnd zu interessierenden partei</w:t>
+        <w:t xml:space="preserve">modell_gewichtet &lt;- </w:t>
+      </w:r>
+      <w:proofErr w:type="gramStart"/>
+      <w:r>
+        <w:t>glm(</w:t>
+      </w:r>
+      <w:r>
+        <w:t xml:space="preserve">  </w:t>
+      </w:r>
+      <w:proofErr w:type="gramEnd"/>
+      <w:r>
+        <w:t xml:space="preserve"> # man betrachtet alle parteien einzelnd zu interessierenden partei</w:t>
       </w:r>
     </w:p>
     <w:p>
@@ -489,14 +576,42 @@
         <w:rPr>
           <w:lang w:val="en-US"/>
         </w:rPr>
-        <w:t xml:space="preserve">  family  = quasibinomial(link = "logit"),</w:t>
-      </w:r>
-    </w:p>
-    <w:p>
+        <w:t xml:space="preserve">  </w:t>
+      </w:r>
+      <w:proofErr w:type="gramStart"/>
       <w:r>
         <w:rPr>
           <w:lang w:val="en-US"/>
         </w:rPr>
+        <w:t>family  =</w:t>
+      </w:r>
+      <w:proofErr w:type="gramEnd"/>
+      <w:r>
+        <w:rPr>
+          <w:lang w:val="en-US"/>
+        </w:rPr>
+        <w:t xml:space="preserve"> </w:t>
+      </w:r>
+      <w:proofErr w:type="gramStart"/>
+      <w:r>
+        <w:rPr>
+          <w:lang w:val="en-US"/>
+        </w:rPr>
+        <w:t>quasibinomial(</w:t>
+      </w:r>
+      <w:proofErr w:type="gramEnd"/>
+      <w:r>
+        <w:rPr>
+          <w:lang w:val="en-US"/>
+        </w:rPr>
+        <w:t>link = "logit"),</w:t>
+      </w:r>
+    </w:p>
+    <w:p>
+      <w:r>
+        <w:rPr>
+          <w:lang w:val="en-US"/>
+        </w:rPr>
         <w:t xml:space="preserve">  </w:t>
       </w:r>
       <w:r>
@@ -510,6 +625,7 @@
     </w:p>
     <w:p>
       <w:r>
+        <w:lastRenderedPageBreak/>
         <w:t>)</w:t>
       </w:r>
       <w:r>
@@ -545,7 +661,6 @@
         </w:numPr>
       </w:pPr>
       <w:r>
-        <w:lastRenderedPageBreak/>
         <w:t>Abhängigkeit aller lokalen Matrizen von derselben globalen nslphom-Lösung.</w:t>
       </w:r>
     </w:p>
@@ -591,16 +706,25 @@
       </w:r>
       <w:r>
         <w:br/>
+      </w:r>
+      <w:proofErr w:type="gramStart"/>
+      <w:r>
         <w:t>coeftest(</w:t>
       </w:r>
+      <w:proofErr w:type="gramEnd"/>
       <w:r>
         <w:br/>
         <w:t xml:space="preserve">  modell_gewichtet,</w:t>
       </w:r>
       <w:r>
         <w:br/>
-        <w:t xml:space="preserve">  vcov = vcovHC(</w:t>
-      </w:r>
+        <w:t xml:space="preserve">  vcov = </w:t>
+      </w:r>
+      <w:proofErr w:type="gramStart"/>
+      <w:r>
+        <w:t>vcovHC(</w:t>
+      </w:r>
+      <w:proofErr w:type="gramEnd"/>
       <w:r>
         <w:br/>
         <w:t xml:space="preserve">    modell_gewichtet,</w:t>
@@ -719,6 +843,7 @@
         <w:br/>
       </w:r>
       <w:r>
+        <w:lastRenderedPageBreak/>
         <w:sym w:font="Wingdings" w:char="F0E0"/>
       </w:r>
       <w:r>
@@ -746,11 +871,7 @@
       </w:r>
       <w:r>
         <w:br/>
-        <w:t xml:space="preserve">1) Veränderung angeschaut wird (Wirtschaft gewachsen/gefallen seit letzter Wahl) also „2025“ - </w:t>
-      </w:r>
-      <w:r>
-        <w:lastRenderedPageBreak/>
-        <w:t>„2021“</w:t>
+        <w:t>1) Veränderung angeschaut wird (Wirtschaft gewachsen/gefallen seit letzter Wahl) also „2025“ - „2021“</w:t>
       </w:r>
       <w:r>
         <w:br/>
@@ -1521,6 +1642,7 @@
   <w:style w:type="character" w:default="1" w:styleId="Absatz-Standardschriftart">
     <w:name w:val="Default Paragraph Font"/>
     <w:uiPriority w:val="1"/>
+    <w:semiHidden/>
     <w:unhideWhenUsed/>
   </w:style>
   <w:style w:type="table" w:default="1" w:styleId="NormaleTabelle">

</xml_diff>